<commit_message>
Schlegelstraße 3: Kurzerläuterung um Grundrissänderungen und Gegenüberstellung ergänzt
Co-Authored-By: Claude Opus 5.5 <noreply@anthropic.com>
Claude-Session: https://claude.ai/code/session_01JR27X7ZZq2WAyXu3NS9X5Z
</commit_message>
<xml_diff>
--- a/schlegelstrasse-3/Kurzerlaeuterung_Installationsknoten.docx
+++ b/schlegelstrasse-3/Kurzerlaeuterung_Installationsknoten.docx
@@ -257,6 +257,151 @@
           <w:szCs w:val="23"/>
         </w:rPr>
         <w:t xml:space="preserve">Betroffene Wohnungen</w:t>
+      </w:r>
+    </w:p>
+    <w:p>
+      <w:pPr>
+        <w:spacing w:after="80"/>
+      </w:pPr>
+      <w:r>
+        <w:rPr>
+          <w:rFonts w:ascii="Arial" w:cs="Arial" w:eastAsia="Arial" w:hAnsi="Arial"/>
+          <w:sz w:val="20"/>
+          <w:szCs w:val="20"/>
+        </w:rPr>
+        <w:t xml:space="preserve">WE 1.01, 1.02, 1.03, 1.05 und 1.09. Die Änderungen sind auf Seite 2 beschrieben und auf den Seiten 3 und 4 als Gegenüberstellung Ausführungsplanung / Vorschlag dargestellt. Alle anderen Wohnungen bleiben unverändert und werden nur an die Knoten angeschlossen.</w:t>
+      </w:r>
+    </w:p>
+    <w:p>
+      <w:pPr>
+        <w:spacing w:after="80" w:before="200"/>
+      </w:pPr>
+      <w:r>
+        <w:rPr>
+          <w:rFonts w:ascii="Arial" w:cs="Arial" w:eastAsia="Arial" w:hAnsi="Arial"/>
+          <w:b/>
+          <w:bCs/>
+          <w:color w:val="1F4E79"/>
+          <w:sz w:val="23"/>
+          <w:szCs w:val="23"/>
+        </w:rPr>
+        <w:t xml:space="preserve">Zu klären</w:t>
+      </w:r>
+    </w:p>
+    <w:p>
+      <w:pPr>
+        <w:pStyle w:val="ListParagraph"/>
+        <w:numPr>
+          <w:ilvl w:val="0"/>
+          <w:numId w:val="2"/>
+        </w:numPr>
+        <w:spacing w:after="50"/>
+      </w:pPr>
+      <w:r>
+        <w:rPr>
+          <w:rFonts w:ascii="Arial" w:cs="Arial" w:eastAsia="Arial" w:hAnsi="Arial"/>
+          <w:sz w:val="20"/>
+          <w:szCs w:val="20"/>
+        </w:rPr>
+        <w:t xml:space="preserve">Statik: Kernbohrungen in den Querwänden B, D, F, G und Deckendurchbrüche (Prüfstatik)</w:t>
+      </w:r>
+    </w:p>
+    <w:p>
+      <w:pPr>
+        <w:pStyle w:val="ListParagraph"/>
+        <w:numPr>
+          <w:ilvl w:val="0"/>
+          <w:numId w:val="2"/>
+        </w:numPr>
+        <w:spacing w:after="50"/>
+      </w:pPr>
+      <w:r>
+        <w:rPr>
+          <w:rFonts w:ascii="Arial" w:cs="Arial" w:eastAsia="Arial" w:hAnsi="Arial"/>
+          <w:sz w:val="20"/>
+          <w:szCs w:val="20"/>
+        </w:rPr>
+        <w:t xml:space="preserve">Brandschutz: F90-Schächte, Elektroschacht im Aufzug-Vorraum</w:t>
+      </w:r>
+    </w:p>
+    <w:p>
+      <w:pPr>
+        <w:pStyle w:val="ListParagraph"/>
+        <w:numPr>
+          <w:ilvl w:val="0"/>
+          <w:numId w:val="2"/>
+        </w:numPr>
+        <w:spacing w:after="50"/>
+      </w:pPr>
+      <w:r>
+        <w:rPr>
+          <w:rFonts w:ascii="Arial" w:cs="Arial" w:eastAsia="Arial" w:hAnsi="Arial"/>
+          <w:sz w:val="20"/>
+          <w:szCs w:val="20"/>
+        </w:rPr>
+        <w:t xml:space="preserve">Schallschutz nach DIN 4109, Abstimmung mit der HLS-/ELT-Planung</w:t>
+      </w:r>
+    </w:p>
+    <w:p>
+      <w:pPr>
+        <w:pStyle w:val="ListParagraph"/>
+        <w:numPr>
+          <w:ilvl w:val="0"/>
+          <w:numId w:val="2"/>
+        </w:numPr>
+        <w:spacing w:after="50"/>
+      </w:pPr>
+      <w:r>
+        <w:rPr>
+          <w:rFonts w:ascii="Arial" w:cs="Arial" w:eastAsia="Arial" w:hAnsi="Arial"/>
+          <w:sz w:val="20"/>
+          <w:szCs w:val="20"/>
+        </w:rPr>
+        <w:t xml:space="preserve">Fortführung in EG, 5. OG und Drempel; Bewertung im laufenden GU-Verfahren</w:t>
+      </w:r>
+    </w:p>
+    <w:p>
+      <w:pPr>
+        <w:pStyle w:val="ListParagraph"/>
+        <w:numPr>
+          <w:ilvl w:val="0"/>
+          <w:numId w:val="2"/>
+        </w:numPr>
+        <w:spacing w:after="50"/>
+      </w:pPr>
+      <w:r>
+        <w:rPr>
+          <w:rFonts w:ascii="Arial" w:cs="Arial" w:eastAsia="Arial" w:hAnsi="Arial"/>
+          <w:sz w:val="20"/>
+          <w:szCs w:val="20"/>
+        </w:rPr>
+        <w:t xml:space="preserve">Option: Heizungsstränge an der Fassade zusätzlich bündeln (erfordert Änderung des HLS-Konzepts)</w:t>
+      </w:r>
+    </w:p>
+    <w:p>
+      <w:pPr>
+        <w:sectPr>
+          <w:footerReference w:type="default" r:id="rId7"/>
+          <w:pgSz w:w="11906" w:h="16838" w:orient="portrait"/>
+          <w:pgMar w:top="1134" w:right="1440" w:bottom="1134" w:left="1440" w:header="708" w:footer="708" w:gutter="0"/>
+          <w:pgNumType/>
+          <w:docGrid w:linePitch="360"/>
+        </w:sectPr>
+      </w:pPr>
+    </w:p>
+    <w:p>
+      <w:pPr>
+        <w:spacing w:after="120"/>
+      </w:pPr>
+      <w:r>
+        <w:rPr>
+          <w:rFonts w:ascii="Arial" w:cs="Arial" w:eastAsia="Arial" w:hAnsi="Arial"/>
+          <w:b/>
+          <w:bCs/>
+          <w:sz w:val="28"/>
+          <w:szCs w:val="28"/>
+        </w:rPr>
+        <w:t xml:space="preserve">Grundrissänderungen im Einzelnen</w:t>
       </w:r>
     </w:p>
     <w:tbl>
@@ -272,14 +417,14 @@
         </w:tblBorders>
       </w:tblPr>
       <w:tblGrid>
-        <w:gridCol w:w="1300"/>
-        <w:gridCol w:w="6000"/>
-        <w:gridCol w:w="1726"/>
+        <w:gridCol w:w="1100"/>
+        <w:gridCol w:w="3963"/>
+        <w:gridCol w:w="3963"/>
       </w:tblGrid>
       <w:tr>
         <w:tc>
           <w:tcPr>
-            <w:tcW w:type="dxa" w:w="1300"/>
+            <w:tcW w:type="dxa" w:w="1100"/>
             <w:tcBorders>
               <w:top w:val="single" w:color="BFBFBF" w:sz="4"/>
               <w:left w:val="single" w:color="BFBFBF" w:sz="4"/>
@@ -309,7 +454,7 @@
         </w:tc>
         <w:tc>
           <w:tcPr>
-            <w:tcW w:type="dxa" w:w="6000"/>
+            <w:tcW w:type="dxa" w:w="3963"/>
             <w:tcBorders>
               <w:top w:val="single" w:color="BFBFBF" w:sz="4"/>
               <w:left w:val="single" w:color="BFBFBF" w:sz="4"/>
@@ -333,13 +478,13 @@
                 <w:sz w:val="19"/>
                 <w:szCs w:val="19"/>
               </w:rPr>
-              <w:t xml:space="preserve">Änderung gegenüber AP Index A</w:t>
+              <w:t xml:space="preserve">Ausführungsplanung Index A</w:t>
             </w:r>
           </w:p>
         </w:tc>
         <w:tc>
           <w:tcPr>
-            <w:tcW w:type="dxa" w:w="1726"/>
+            <w:tcW w:type="dxa" w:w="3963"/>
             <w:tcBorders>
               <w:top w:val="single" w:color="BFBFBF" w:sz="4"/>
               <w:left w:val="single" w:color="BFBFBF" w:sz="4"/>
@@ -363,7 +508,7 @@
                 <w:sz w:val="19"/>
                 <w:szCs w:val="19"/>
               </w:rPr>
-              <w:t xml:space="preserve">Fläche</w:t>
+              <w:t xml:space="preserve">Vorschlag</w:t>
             </w:r>
           </w:p>
         </w:tc>
@@ -371,7 +516,7 @@
       <w:tr>
         <w:tc>
           <w:tcPr>
-            <w:tcW w:type="dxa" w:w="1300"/>
+            <w:tcW w:type="dxa" w:w="1100"/>
             <w:tcBorders>
               <w:top w:val="single" w:color="BFBFBF" w:sz="4"/>
               <w:left w:val="single" w:color="BFBFBF" w:sz="4"/>
@@ -394,13 +539,13 @@
                 <w:sz w:val="19"/>
                 <w:szCs w:val="19"/>
               </w:rPr>
-              <w:t xml:space="preserve">1.05 / 1.09</w:t>
+              <w:t xml:space="preserve">1.05</w:t>
             </w:r>
           </w:p>
         </w:tc>
         <w:tc>
           <w:tcPr>
-            <w:tcW w:type="dxa" w:w="6000"/>
+            <w:tcW w:type="dxa" w:w="3963"/>
             <w:tcBorders>
               <w:top w:val="single" w:color="BFBFBF" w:sz="4"/>
               <w:left w:val="single" w:color="BFBFBF" w:sz="4"/>
@@ -423,13 +568,13 @@
                 <w:sz w:val="19"/>
                 <w:szCs w:val="19"/>
               </w:rPr>
-              <w:t xml:space="preserve">Bad und Flur im flurseitigen Band getauscht; Küche an die Bad-Rückwand; Eingangstür versetzt</w:t>
+              <w:t xml:space="preserve">Bad an Achse F, Flur und Eingang an Achse G. Küchenzeile an der Trennwand Schlafen/Wohnen. Eigener Strang an Achse F.</w:t>
             </w:r>
           </w:p>
         </w:tc>
         <w:tc>
           <w:tcPr>
-            <w:tcW w:type="dxa" w:w="1726"/>
+            <w:tcW w:type="dxa" w:w="3963"/>
             <w:tcBorders>
               <w:top w:val="single" w:color="BFBFBF" w:sz="4"/>
               <w:left w:val="single" w:color="BFBFBF" w:sz="4"/>
@@ -452,7 +597,7 @@
                 <w:sz w:val="19"/>
                 <w:szCs w:val="19"/>
               </w:rPr>
-              <w:t xml:space="preserve">unverändert</w:t>
+              <w:t xml:space="preserve">Bad und Flur getauscht: Bad an Achse G, Rücken an Rücken mit Bad 1.06. Flur und Eingang an Achse F. Küchenzeile an der Bad-Rückwand. Gemeinsamer Schacht IS 6.</w:t>
             </w:r>
           </w:p>
         </w:tc>
@@ -460,7 +605,7 @@
       <w:tr>
         <w:tc>
           <w:tcPr>
-            <w:tcW w:type="dxa" w:w="1300"/>
+            <w:tcW w:type="dxa" w:w="1100"/>
             <w:tcBorders>
               <w:top w:val="single" w:color="BFBFBF" w:sz="4"/>
               <w:left w:val="single" w:color="BFBFBF" w:sz="4"/>
@@ -483,13 +628,13 @@
                 <w:sz w:val="19"/>
                 <w:szCs w:val="19"/>
               </w:rPr>
-              <w:t xml:space="preserve">1.03</w:t>
+              <w:t xml:space="preserve">1.09</w:t>
             </w:r>
           </w:p>
         </w:tc>
         <w:tc>
           <w:tcPr>
-            <w:tcW w:type="dxa" w:w="6000"/>
+            <w:tcW w:type="dxa" w:w="3963"/>
             <w:tcBorders>
               <w:top w:val="single" w:color="BFBFBF" w:sz="4"/>
               <w:left w:val="single" w:color="BFBFBF" w:sz="4"/>
@@ -512,13 +657,13 @@
                 <w:sz w:val="19"/>
                 <w:szCs w:val="19"/>
               </w:rPr>
-              <w:t xml:space="preserve">Küchenzeile von Achse C an Achse D (Rücken an Rücken mit Küche 1.04)</w:t>
+              <w:t xml:space="preserve">Bad an Achse G, Flur und Eingang an Achse F. Küchenzeile an der Trennwand Wohnen/Schlafen. Eigener Strang an Achse G.</w:t>
             </w:r>
           </w:p>
         </w:tc>
         <w:tc>
           <w:tcPr>
-            <w:tcW w:type="dxa" w:w="1726"/>
+            <w:tcW w:type="dxa" w:w="3963"/>
             <w:tcBorders>
               <w:top w:val="single" w:color="BFBFBF" w:sz="4"/>
               <w:left w:val="single" w:color="BFBFBF" w:sz="4"/>
@@ -541,7 +686,7 @@
                 <w:sz w:val="19"/>
                 <w:szCs w:val="19"/>
               </w:rPr>
-              <w:t xml:space="preserve">unverändert</w:t>
+              <w:t xml:space="preserve">Bad und Flur getauscht: Bad an Achse F, Rücken an Rücken mit Bad 1.10. Flur und Eingang an Achse G. Küchenzeile an der Bad-Rückwand. Gemeinsamer Schacht IS 5.</w:t>
             </w:r>
           </w:p>
         </w:tc>
@@ -549,7 +694,7 @@
       <w:tr>
         <w:tc>
           <w:tcPr>
-            <w:tcW w:type="dxa" w:w="1300"/>
+            <w:tcW w:type="dxa" w:w="1100"/>
             <w:tcBorders>
               <w:top w:val="single" w:color="BFBFBF" w:sz="4"/>
               <w:left w:val="single" w:color="BFBFBF" w:sz="4"/>
@@ -572,13 +717,13 @@
                 <w:sz w:val="19"/>
                 <w:szCs w:val="19"/>
               </w:rPr>
-              <w:t xml:space="preserve">1.01</w:t>
+              <w:t xml:space="preserve">1.03</w:t>
             </w:r>
           </w:p>
         </w:tc>
         <w:tc>
           <w:tcPr>
-            <w:tcW w:type="dxa" w:w="6000"/>
+            <w:tcW w:type="dxa" w:w="3963"/>
             <w:tcBorders>
               <w:top w:val="single" w:color="BFBFBF" w:sz="4"/>
               <w:left w:val="single" w:color="BFBFBF" w:sz="4"/>
@@ -601,13 +746,13 @@
                 <w:sz w:val="19"/>
                 <w:szCs w:val="19"/>
               </w:rPr>
-              <w:t xml:space="preserve">Küchenzeile an die Bad-Installationswand; WM ins Bad; HWR wird Abstellraum</w:t>
+              <w:t xml:space="preserve">Küchenzeile im Wohnen/Kochen an Achse C mit eigener Installationswand. Bad an Achse B mit eigenem Strang.</w:t>
             </w:r>
           </w:p>
         </w:tc>
         <w:tc>
           <w:tcPr>
-            <w:tcW w:type="dxa" w:w="1726"/>
+            <w:tcW w:type="dxa" w:w="3963"/>
             <w:tcBorders>
               <w:top w:val="single" w:color="BFBFBF" w:sz="4"/>
               <w:left w:val="single" w:color="BFBFBF" w:sz="4"/>
@@ -630,7 +775,7 @@
                 <w:sz w:val="19"/>
                 <w:szCs w:val="19"/>
               </w:rPr>
-              <w:t xml:space="preserve">unverändert</w:t>
+              <w:t xml:space="preserve">Küchenzeile an Achse D, Rücken an Rücken mit Küche 1.04 (IS 2). Bad an Schacht IS 1. Räume unverändert.</w:t>
             </w:r>
           </w:p>
         </w:tc>
@@ -638,7 +783,7 @@
       <w:tr>
         <w:tc>
           <w:tcPr>
-            <w:tcW w:type="dxa" w:w="1300"/>
+            <w:tcW w:type="dxa" w:w="1100"/>
             <w:tcBorders>
               <w:top w:val="single" w:color="BFBFBF" w:sz="4"/>
               <w:left w:val="single" w:color="BFBFBF" w:sz="4"/>
@@ -661,13 +806,13 @@
                 <w:sz w:val="19"/>
                 <w:szCs w:val="19"/>
               </w:rPr>
-              <w:t xml:space="preserve">1.02 / 1.07</w:t>
+              <w:t xml:space="preserve">1.01</w:t>
             </w:r>
           </w:p>
         </w:tc>
         <w:tc>
           <w:tcPr>
-            <w:tcW w:type="dxa" w:w="6000"/>
+            <w:tcW w:type="dxa" w:w="3963"/>
             <w:tcBorders>
               <w:top w:val="single" w:color="BFBFBF" w:sz="4"/>
               <w:left w:val="single" w:color="BFBFBF" w:sz="4"/>
@@ -690,13 +835,13 @@
                 <w:sz w:val="19"/>
                 <w:szCs w:val="19"/>
               </w:rPr>
-              <w:t xml:space="preserve">Nassräume der Mittelzone auf je einen Schacht; zweiter Steiger an Achse C entfällt</w:t>
+              <w:t xml:space="preserve">Küchenzeile an der Flurwand (Achse 2). WM im Raum 1.01.01 an Achse E mit eigenem Anschluss.</w:t>
             </w:r>
           </w:p>
         </w:tc>
         <w:tc>
           <w:tcPr>
-            <w:tcW w:type="dxa" w:w="1726"/>
+            <w:tcW w:type="dxa" w:w="3963"/>
             <w:tcBorders>
               <w:top w:val="single" w:color="BFBFBF" w:sz="4"/>
               <w:left w:val="single" w:color="BFBFBF" w:sz="4"/>
@@ -719,7 +864,7 @@
                 <w:sz w:val="19"/>
                 <w:szCs w:val="19"/>
               </w:rPr>
-              <w:t xml:space="preserve">unverändert</w:t>
+              <w:t xml:space="preserve">Küchenzeile an der Trennwand zum Bad (IS 3). WM im Bad. Raum 1.01.01 wird Abstellraum ohne Wasseranschluss.</w:t>
             </w:r>
           </w:p>
         </w:tc>
@@ -727,7 +872,7 @@
       <w:tr>
         <w:tc>
           <w:tcPr>
-            <w:tcW w:type="dxa" w:w="1300"/>
+            <w:tcW w:type="dxa" w:w="1100"/>
             <w:tcBorders>
               <w:top w:val="single" w:color="BFBFBF" w:sz="4"/>
               <w:left w:val="single" w:color="BFBFBF" w:sz="4"/>
@@ -750,13 +895,13 @@
                 <w:sz w:val="19"/>
                 <w:szCs w:val="19"/>
               </w:rPr>
-              <w:t xml:space="preserve">übrige</w:t>
+              <w:t xml:space="preserve">1.02</w:t>
             </w:r>
           </w:p>
         </w:tc>
         <w:tc>
           <w:tcPr>
-            <w:tcW w:type="dxa" w:w="6000"/>
+            <w:tcW w:type="dxa" w:w="3963"/>
             <w:tcBorders>
               <w:top w:val="single" w:color="BFBFBF" w:sz="4"/>
               <w:left w:val="single" w:color="BFBFBF" w:sz="4"/>
@@ -779,13 +924,13 @@
                 <w:sz w:val="19"/>
                 <w:szCs w:val="19"/>
               </w:rPr>
-              <w:t xml:space="preserve">Grundriss unverändert, Anschluss an den jeweiligen Knoten</w:t>
+              <w:t xml:space="preserve">Zwei Steiger in der Mittelzone (Küche/Gäste-Bad und Achse C), Bad 1.02.08 separat angebunden.</w:t>
             </w:r>
           </w:p>
         </w:tc>
         <w:tc>
           <w:tcPr>
-            <w:tcW w:type="dxa" w:w="1726"/>
+            <w:tcW w:type="dxa" w:w="3963"/>
             <w:tcBorders>
               <w:top w:val="single" w:color="BFBFBF" w:sz="4"/>
               <w:left w:val="single" w:color="BFBFBF" w:sz="4"/>
@@ -808,7 +953,7 @@
                 <w:sz w:val="19"/>
                 <w:szCs w:val="19"/>
               </w:rPr>
-              <w:t xml:space="preserve">unverändert</w:t>
+              <w:t xml:space="preserve">Grundriss unverändert. Küche, Gäste-Bad, Bad und HWR an einen Schacht IS 1 an Achse B, gemeinsam mit Bad 1.03.</w:t>
             </w:r>
           </w:p>
         </w:tc>
@@ -816,19 +961,213 @@
     </w:tbl>
     <w:p>
       <w:pPr>
-        <w:spacing w:after="80" w:before="200"/>
+        <w:spacing w:before="160"/>
+      </w:pPr>
+      <w:r>
+        <w:rPr>
+          <w:rFonts w:ascii="Arial" w:cs="Arial" w:eastAsia="Arial" w:hAnsi="Arial"/>
+          <w:color w:val="595959"/>
+          <w:sz w:val="19"/>
+          <w:szCs w:val="19"/>
+        </w:rPr>
+        <w:t xml:space="preserve">Raum- und Wohnungsflächen bleiben gemäß AP Index A erhalten. Abweichungen durch die Schachtlage liegen je Wohnung unter 0,5 m².</w:t>
+      </w:r>
+    </w:p>
+    <w:p>
+      <w:pPr>
+        <w:sectPr>
+          <w:footerReference w:type="default" r:id="rId8"/>
+          <w:pgSz w:w="11906" w:h="16838" w:orient="portrait"/>
+          <w:pgMar w:top="1134" w:right="1440" w:bottom="1134" w:left="1440" w:header="708" w:footer="708" w:gutter="0"/>
+          <w:pgNumType/>
+          <w:docGrid w:linePitch="360"/>
+        </w:sectPr>
+      </w:pPr>
+    </w:p>
+    <w:p>
+      <w:pPr>
+        <w:spacing w:after="120"/>
       </w:pPr>
       <w:r>
         <w:rPr>
           <w:rFonts w:ascii="Arial" w:cs="Arial" w:eastAsia="Arial" w:hAnsi="Arial"/>
           <w:b/>
           <w:bCs/>
-          <w:color w:val="1F4E79"/>
-          <w:sz w:val="23"/>
-          <w:szCs w:val="23"/>
-        </w:rPr>
-        <w:t xml:space="preserve">Zu klären</w:t>
-      </w:r>
+          <w:sz w:val="24"/>
+          <w:szCs w:val="24"/>
+        </w:rPr>
+        <w:t xml:space="preserve">Gegenüberstellung Achsen C–E (WE 1.03, 1.04, 1.01)</w:t>
+      </w:r>
+    </w:p>
+    <w:tbl>
+      <w:tblPr>
+        <w:tblW w:type="dxa" w:w="15038"/>
+        <w:tblBorders>
+          <w:top w:val="single" w:color="auto" w:sz="4"/>
+          <w:left w:val="single" w:color="auto" w:sz="4"/>
+          <w:bottom w:val="single" w:color="auto" w:sz="4"/>
+          <w:right w:val="single" w:color="auto" w:sz="4"/>
+          <w:insideH w:val="single" w:color="auto" w:sz="4"/>
+          <w:insideV w:val="single" w:color="auto" w:sz="4"/>
+        </w:tblBorders>
+      </w:tblPr>
+      <w:tblGrid>
+        <w:gridCol w:w="7519"/>
+        <w:gridCol w:w="7519"/>
+      </w:tblGrid>
+      <w:tr>
+        <w:tc>
+          <w:tcPr>
+            <w:tcW w:type="dxa" w:w="7519"/>
+            <w:tcBorders>
+              <w:top w:val="none" w:color="FFFFFF" w:sz="0"/>
+              <w:left w:val="none" w:color="FFFFFF" w:sz="0"/>
+              <w:bottom w:val="none" w:color="FFFFFF" w:sz="0"/>
+              <w:right w:val="none" w:color="FFFFFF" w:sz="0"/>
+            </w:tcBorders>
+            <w:tcMar>
+              <w:left w:type="dxa" w:w="60"/>
+              <w:right w:type="dxa" w:w="60"/>
+            </w:tcMar>
+          </w:tcPr>
+          <w:p>
+            <w:pPr>
+              <w:spacing w:after="40"/>
+            </w:pPr>
+            <w:r>
+              <w:rPr>
+                <w:rFonts w:ascii="Arial" w:cs="Arial" w:eastAsia="Arial" w:hAnsi="Arial"/>
+                <w:b/>
+                <w:bCs/>
+                <w:color w:val="1F4E79"/>
+                <w:sz w:val="19"/>
+                <w:szCs w:val="19"/>
+              </w:rPr>
+              <w:t xml:space="preserve">Ausführungsplanung Index A</w:t>
+            </w:r>
+          </w:p>
+          <w:p>
+            <w:r>
+              <w:drawing>
+                <wp:inline distT="0" distB="0" distL="0" distR="0">
+                  <wp:extent cx="3571875" cy="4267200"/>
+                  <wp:effectExtent t="0" r="0" b="0" l="0"/>
+                  <wp:docPr id="1" name="" descr="" title=""/>
+                  <wp:cNvGraphicFramePr>
+                    <a:graphicFrameLocks xmlns:a="http://schemas.openxmlformats.org/drawingml/2006/main" noChangeAspect="1"/>
+                  </wp:cNvGraphicFramePr>
+                  <a:graphic xmlns:a="http://schemas.openxmlformats.org/drawingml/2006/main">
+                    <a:graphicData uri="http://schemas.openxmlformats.org/drawingml/2006/picture">
+                      <pic:pic xmlns:pic="http://schemas.openxmlformats.org/drawingml/2006/picture">
+                        <pic:nvPicPr>
+                          <pic:cNvPr id="0" name="" descr=""/>
+                          <pic:cNvPicPr>
+                            <a:picLocks noChangeAspect="1" noChangeArrowheads="1"/>
+                          </pic:cNvPicPr>
+                        </pic:nvPicPr>
+                        <pic:blipFill>
+                          <a:blip r:embed="rId12" cstate="none"/>
+                          <a:srcRect/>
+                          <a:stretch>
+                            <a:fillRect/>
+                          </a:stretch>
+                        </pic:blipFill>
+                        <pic:spPr bwMode="auto">
+                          <a:xfrm>
+                            <a:off x="0" y="0"/>
+                            <a:ext cx="3571875" cy="4267200"/>
+                          </a:xfrm>
+                          <a:prstGeom prst="rect">
+                            <a:avLst/>
+                          </a:prstGeom>
+                        </pic:spPr>
+                      </pic:pic>
+                    </a:graphicData>
+                  </a:graphic>
+                </wp:inline>
+              </w:drawing>
+            </w:r>
+          </w:p>
+        </w:tc>
+        <w:tc>
+          <w:tcPr>
+            <w:tcW w:type="dxa" w:w="7519"/>
+            <w:tcBorders>
+              <w:top w:val="none" w:color="FFFFFF" w:sz="0"/>
+              <w:left w:val="none" w:color="FFFFFF" w:sz="0"/>
+              <w:bottom w:val="none" w:color="FFFFFF" w:sz="0"/>
+              <w:right w:val="none" w:color="FFFFFF" w:sz="0"/>
+            </w:tcBorders>
+            <w:tcMar>
+              <w:left w:type="dxa" w:w="60"/>
+              <w:right w:type="dxa" w:w="60"/>
+            </w:tcMar>
+          </w:tcPr>
+          <w:p>
+            <w:pPr>
+              <w:spacing w:after="40"/>
+            </w:pPr>
+            <w:r>
+              <w:rPr>
+                <w:rFonts w:ascii="Arial" w:cs="Arial" w:eastAsia="Arial" w:hAnsi="Arial"/>
+                <w:b/>
+                <w:bCs/>
+                <w:color w:val="1F4E79"/>
+                <w:sz w:val="19"/>
+                <w:szCs w:val="19"/>
+              </w:rPr>
+              <w:t xml:space="preserve">Vorschlag (gelb = geändert, rot = Schacht)</w:t>
+            </w:r>
+          </w:p>
+          <w:p>
+            <w:r>
+              <w:drawing>
+                <wp:inline distT="0" distB="0" distL="0" distR="0">
+                  <wp:extent cx="3571875" cy="4267200"/>
+                  <wp:effectExtent t="0" r="0" b="0" l="0"/>
+                  <wp:docPr id="1" name="" descr="" title=""/>
+                  <wp:cNvGraphicFramePr>
+                    <a:graphicFrameLocks xmlns:a="http://schemas.openxmlformats.org/drawingml/2006/main" noChangeAspect="1"/>
+                  </wp:cNvGraphicFramePr>
+                  <a:graphic xmlns:a="http://schemas.openxmlformats.org/drawingml/2006/main">
+                    <a:graphicData uri="http://schemas.openxmlformats.org/drawingml/2006/picture">
+                      <pic:pic xmlns:pic="http://schemas.openxmlformats.org/drawingml/2006/picture">
+                        <pic:nvPicPr>
+                          <pic:cNvPr id="0" name="" descr=""/>
+                          <pic:cNvPicPr>
+                            <a:picLocks noChangeAspect="1" noChangeArrowheads="1"/>
+                          </pic:cNvPicPr>
+                        </pic:nvPicPr>
+                        <pic:blipFill>
+                          <a:blip r:embed="rId13" cstate="none"/>
+                          <a:srcRect/>
+                          <a:stretch>
+                            <a:fillRect/>
+                          </a:stretch>
+                        </pic:blipFill>
+                        <pic:spPr bwMode="auto">
+                          <a:xfrm>
+                            <a:off x="0" y="0"/>
+                            <a:ext cx="3571875" cy="4267200"/>
+                          </a:xfrm>
+                          <a:prstGeom prst="rect">
+                            <a:avLst/>
+                          </a:prstGeom>
+                        </pic:spPr>
+                      </pic:pic>
+                    </a:graphicData>
+                  </a:graphic>
+                </wp:inline>
+              </w:drawing>
+            </w:r>
+          </w:p>
+        </w:tc>
+      </w:tr>
+    </w:tbl>
+    <w:p>
+      <w:pPr>
+        <w:spacing w:after="60"/>
+      </w:pPr>
     </w:p>
     <w:p>
       <w:pPr>
@@ -842,10 +1181,20 @@
       <w:r>
         <w:rPr>
           <w:rFonts w:ascii="Arial" w:cs="Arial" w:eastAsia="Arial" w:hAnsi="Arial"/>
-          <w:sz w:val="20"/>
-          <w:szCs w:val="20"/>
-        </w:rPr>
-        <w:t xml:space="preserve">Statik: Kernbohrungen in den Querwänden B, D, F, G und Deckendurchbrüche (Prüfstatik)</w:t>
+          <w:b/>
+          <w:bCs/>
+          <w:sz w:val="20"/>
+          <w:szCs w:val="20"/>
+        </w:rPr>
+        <w:t xml:space="preserve">WE 1.03: </w:t>
+      </w:r>
+      <w:r>
+        <w:rPr>
+          <w:rFonts w:ascii="Arial" w:cs="Arial" w:eastAsia="Arial" w:hAnsi="Arial"/>
+          <w:sz w:val="20"/>
+          <w:szCs w:val="20"/>
+        </w:rPr>
+        <w:t xml:space="preserve">Küchenzeile von Achse C an Achse D; Anschluss gemeinsam mit WE 1.04 an IS 2.</w:t>
       </w:r>
     </w:p>
     <w:p>
@@ -860,10 +1209,20 @@
       <w:r>
         <w:rPr>
           <w:rFonts w:ascii="Arial" w:cs="Arial" w:eastAsia="Arial" w:hAnsi="Arial"/>
-          <w:sz w:val="20"/>
-          <w:szCs w:val="20"/>
-        </w:rPr>
-        <w:t xml:space="preserve">Brandschutz: F90-Schächte, Elektroschacht im Aufzug-Vorraum</w:t>
+          <w:b/>
+          <w:bCs/>
+          <w:sz w:val="20"/>
+          <w:szCs w:val="20"/>
+        </w:rPr>
+        <w:t xml:space="preserve">WE 1.01: </w:t>
+      </w:r>
+      <w:r>
+        <w:rPr>
+          <w:rFonts w:ascii="Arial" w:cs="Arial" w:eastAsia="Arial" w:hAnsi="Arial"/>
+          <w:sz w:val="20"/>
+          <w:szCs w:val="20"/>
+        </w:rPr>
+        <w:t xml:space="preserve">Küchenzeile von der Flurwand an die Badwand; WM ins Bad; Raum 1.01.01 wird Abstellraum. Ein Schacht IS 3 statt drei Anschlussstellen.</w:t>
       </w:r>
     </w:p>
     <w:p>
@@ -878,11 +1237,217 @@
       <w:r>
         <w:rPr>
           <w:rFonts w:ascii="Arial" w:cs="Arial" w:eastAsia="Arial" w:hAnsi="Arial"/>
-          <w:sz w:val="20"/>
-          <w:szCs w:val="20"/>
-        </w:rPr>
-        <w:t xml:space="preserve">Schallschutz nach DIN 4109, Abstimmung mit der HLS-/ELT-Planung</w:t>
-      </w:r>
+          <w:b/>
+          <w:bCs/>
+          <w:sz w:val="20"/>
+          <w:szCs w:val="20"/>
+        </w:rPr>
+        <w:t xml:space="preserve">WE 1.04: </w:t>
+      </w:r>
+      <w:r>
+        <w:rPr>
+          <w:rFonts w:ascii="Arial" w:cs="Arial" w:eastAsia="Arial" w:hAnsi="Arial"/>
+          <w:sz w:val="20"/>
+          <w:szCs w:val="20"/>
+        </w:rPr>
+        <w:t xml:space="preserve">unverändert.</w:t>
+      </w:r>
+    </w:p>
+    <w:p>
+      <w:pPr>
+        <w:sectPr>
+          <w:footerReference w:type="default" r:id="rId9"/>
+          <w:pgSz w:w="16838" w:h="11906" w:orient="landscape"/>
+          <w:pgMar w:top="900" w:right="900" w:bottom="900" w:left="900" w:header="708" w:footer="708" w:gutter="0"/>
+          <w:pgNumType/>
+          <w:docGrid w:linePitch="360"/>
+        </w:sectPr>
+      </w:pPr>
+    </w:p>
+    <w:p>
+      <w:pPr>
+        <w:spacing w:after="120"/>
+      </w:pPr>
+      <w:r>
+        <w:rPr>
+          <w:rFonts w:ascii="Arial" w:cs="Arial" w:eastAsia="Arial" w:hAnsi="Arial"/>
+          <w:b/>
+          <w:bCs/>
+          <w:sz w:val="24"/>
+          <w:szCs w:val="24"/>
+        </w:rPr>
+        <w:t xml:space="preserve">Gegenüberstellung Achsen E–H (WE 1.10, 1.05, 1.06, 1.09, 1.08)</w:t>
+      </w:r>
+    </w:p>
+    <w:tbl>
+      <w:tblPr>
+        <w:tblW w:type="dxa" w:w="15038"/>
+        <w:tblBorders>
+          <w:top w:val="single" w:color="auto" w:sz="4"/>
+          <w:left w:val="single" w:color="auto" w:sz="4"/>
+          <w:bottom w:val="single" w:color="auto" w:sz="4"/>
+          <w:right w:val="single" w:color="auto" w:sz="4"/>
+          <w:insideH w:val="single" w:color="auto" w:sz="4"/>
+          <w:insideV w:val="single" w:color="auto" w:sz="4"/>
+        </w:tblBorders>
+      </w:tblPr>
+      <w:tblGrid>
+        <w:gridCol w:w="7519"/>
+        <w:gridCol w:w="7519"/>
+      </w:tblGrid>
+      <w:tr>
+        <w:tc>
+          <w:tcPr>
+            <w:tcW w:type="dxa" w:w="7519"/>
+            <w:tcBorders>
+              <w:top w:val="none" w:color="FFFFFF" w:sz="0"/>
+              <w:left w:val="none" w:color="FFFFFF" w:sz="0"/>
+              <w:bottom w:val="none" w:color="FFFFFF" w:sz="0"/>
+              <w:right w:val="none" w:color="FFFFFF" w:sz="0"/>
+            </w:tcBorders>
+            <w:tcMar>
+              <w:left w:type="dxa" w:w="60"/>
+              <w:right w:type="dxa" w:w="60"/>
+            </w:tcMar>
+          </w:tcPr>
+          <w:p>
+            <w:pPr>
+              <w:spacing w:after="40"/>
+            </w:pPr>
+            <w:r>
+              <w:rPr>
+                <w:rFonts w:ascii="Arial" w:cs="Arial" w:eastAsia="Arial" w:hAnsi="Arial"/>
+                <w:b/>
+                <w:bCs/>
+                <w:color w:val="1F4E79"/>
+                <w:sz w:val="19"/>
+                <w:szCs w:val="19"/>
+              </w:rPr>
+              <w:t xml:space="preserve">Ausführungsplanung Index A</w:t>
+            </w:r>
+          </w:p>
+          <w:p>
+            <w:r>
+              <w:drawing>
+                <wp:inline distT="0" distB="0" distL="0" distR="0">
+                  <wp:extent cx="4476750" cy="3629025"/>
+                  <wp:effectExtent t="0" r="0" b="0" l="0"/>
+                  <wp:docPr id="1" name="" descr="" title=""/>
+                  <wp:cNvGraphicFramePr>
+                    <a:graphicFrameLocks xmlns:a="http://schemas.openxmlformats.org/drawingml/2006/main" noChangeAspect="1"/>
+                  </wp:cNvGraphicFramePr>
+                  <a:graphic xmlns:a="http://schemas.openxmlformats.org/drawingml/2006/main">
+                    <a:graphicData uri="http://schemas.openxmlformats.org/drawingml/2006/picture">
+                      <pic:pic xmlns:pic="http://schemas.openxmlformats.org/drawingml/2006/picture">
+                        <pic:nvPicPr>
+                          <pic:cNvPr id="0" name="" descr=""/>
+                          <pic:cNvPicPr>
+                            <a:picLocks noChangeAspect="1" noChangeArrowheads="1"/>
+                          </pic:cNvPicPr>
+                        </pic:nvPicPr>
+                        <pic:blipFill>
+                          <a:blip r:embed="rId14" cstate="none"/>
+                          <a:srcRect/>
+                          <a:stretch>
+                            <a:fillRect/>
+                          </a:stretch>
+                        </pic:blipFill>
+                        <pic:spPr bwMode="auto">
+                          <a:xfrm>
+                            <a:off x="0" y="0"/>
+                            <a:ext cx="4476750" cy="3629025"/>
+                          </a:xfrm>
+                          <a:prstGeom prst="rect">
+                            <a:avLst/>
+                          </a:prstGeom>
+                        </pic:spPr>
+                      </pic:pic>
+                    </a:graphicData>
+                  </a:graphic>
+                </wp:inline>
+              </w:drawing>
+            </w:r>
+          </w:p>
+        </w:tc>
+        <w:tc>
+          <w:tcPr>
+            <w:tcW w:type="dxa" w:w="7519"/>
+            <w:tcBorders>
+              <w:top w:val="none" w:color="FFFFFF" w:sz="0"/>
+              <w:left w:val="none" w:color="FFFFFF" w:sz="0"/>
+              <w:bottom w:val="none" w:color="FFFFFF" w:sz="0"/>
+              <w:right w:val="none" w:color="FFFFFF" w:sz="0"/>
+            </w:tcBorders>
+            <w:tcMar>
+              <w:left w:type="dxa" w:w="60"/>
+              <w:right w:type="dxa" w:w="60"/>
+            </w:tcMar>
+          </w:tcPr>
+          <w:p>
+            <w:pPr>
+              <w:spacing w:after="40"/>
+            </w:pPr>
+            <w:r>
+              <w:rPr>
+                <w:rFonts w:ascii="Arial" w:cs="Arial" w:eastAsia="Arial" w:hAnsi="Arial"/>
+                <w:b/>
+                <w:bCs/>
+                <w:color w:val="1F4E79"/>
+                <w:sz w:val="19"/>
+                <w:szCs w:val="19"/>
+              </w:rPr>
+              <w:t xml:space="preserve">Vorschlag (gelb = geändert, rot = Schacht)</w:t>
+            </w:r>
+          </w:p>
+          <w:p>
+            <w:r>
+              <w:drawing>
+                <wp:inline distT="0" distB="0" distL="0" distR="0">
+                  <wp:extent cx="4476750" cy="3629025"/>
+                  <wp:effectExtent t="0" r="0" b="0" l="0"/>
+                  <wp:docPr id="1" name="" descr="" title=""/>
+                  <wp:cNvGraphicFramePr>
+                    <a:graphicFrameLocks xmlns:a="http://schemas.openxmlformats.org/drawingml/2006/main" noChangeAspect="1"/>
+                  </wp:cNvGraphicFramePr>
+                  <a:graphic xmlns:a="http://schemas.openxmlformats.org/drawingml/2006/main">
+                    <a:graphicData uri="http://schemas.openxmlformats.org/drawingml/2006/picture">
+                      <pic:pic xmlns:pic="http://schemas.openxmlformats.org/drawingml/2006/picture">
+                        <pic:nvPicPr>
+                          <pic:cNvPr id="0" name="" descr=""/>
+                          <pic:cNvPicPr>
+                            <a:picLocks noChangeAspect="1" noChangeArrowheads="1"/>
+                          </pic:cNvPicPr>
+                        </pic:nvPicPr>
+                        <pic:blipFill>
+                          <a:blip r:embed="rId15" cstate="none"/>
+                          <a:srcRect/>
+                          <a:stretch>
+                            <a:fillRect/>
+                          </a:stretch>
+                        </pic:blipFill>
+                        <pic:spPr bwMode="auto">
+                          <a:xfrm>
+                            <a:off x="0" y="0"/>
+                            <a:ext cx="4476750" cy="3629025"/>
+                          </a:xfrm>
+                          <a:prstGeom prst="rect">
+                            <a:avLst/>
+                          </a:prstGeom>
+                        </pic:spPr>
+                      </pic:pic>
+                    </a:graphicData>
+                  </a:graphic>
+                </wp:inline>
+              </w:drawing>
+            </w:r>
+          </w:p>
+        </w:tc>
+      </w:tr>
+    </w:tbl>
+    <w:p>
+      <w:pPr>
+        <w:spacing w:after="60"/>
+      </w:pPr>
     </w:p>
     <w:p>
       <w:pPr>
@@ -896,10 +1461,20 @@
       <w:r>
         <w:rPr>
           <w:rFonts w:ascii="Arial" w:cs="Arial" w:eastAsia="Arial" w:hAnsi="Arial"/>
-          <w:sz w:val="20"/>
-          <w:szCs w:val="20"/>
-        </w:rPr>
-        <w:t xml:space="preserve">Fortführung in EG, 5. OG und Drempel; Bewertung im laufenden GU-Verfahren</w:t>
+          <w:b/>
+          <w:bCs/>
+          <w:sz w:val="20"/>
+          <w:szCs w:val="20"/>
+        </w:rPr>
+        <w:t xml:space="preserve">WE 1.05: </w:t>
+      </w:r>
+      <w:r>
+        <w:rPr>
+          <w:rFonts w:ascii="Arial" w:cs="Arial" w:eastAsia="Arial" w:hAnsi="Arial"/>
+          <w:sz w:val="20"/>
+          <w:szCs w:val="20"/>
+        </w:rPr>
+        <w:t xml:space="preserve">Bad und Flur getauscht. Das Bad liegt jetzt an Achse G neben Bad 1.06, beide an Schacht IS 6.</w:t>
       </w:r>
     </w:p>
     <w:p>
@@ -914,18 +1489,56 @@
       <w:r>
         <w:rPr>
           <w:rFonts w:ascii="Arial" w:cs="Arial" w:eastAsia="Arial" w:hAnsi="Arial"/>
-          <w:sz w:val="20"/>
-          <w:szCs w:val="20"/>
-        </w:rPr>
-        <w:t xml:space="preserve">Option: Heizungsstränge an der Fassade zusätzlich bündeln (erfordert Änderung des HLS-Konzepts)</w:t>
+          <w:b/>
+          <w:bCs/>
+          <w:sz w:val="20"/>
+          <w:szCs w:val="20"/>
+        </w:rPr>
+        <w:t xml:space="preserve">WE 1.09: </w:t>
+      </w:r>
+      <w:r>
+        <w:rPr>
+          <w:rFonts w:ascii="Arial" w:cs="Arial" w:eastAsia="Arial" w:hAnsi="Arial"/>
+          <w:sz w:val="20"/>
+          <w:szCs w:val="20"/>
+        </w:rPr>
+        <w:t xml:space="preserve">Bad und Flur getauscht. Das Bad liegt jetzt an Achse F neben Bad 1.10, beide an Schacht IS 5.</w:t>
+      </w:r>
+    </w:p>
+    <w:p>
+      <w:pPr>
+        <w:pStyle w:val="ListParagraph"/>
+        <w:numPr>
+          <w:ilvl w:val="0"/>
+          <w:numId w:val="2"/>
+        </w:numPr>
+        <w:spacing w:after="50"/>
+      </w:pPr>
+      <w:r>
+        <w:rPr>
+          <w:rFonts w:ascii="Arial" w:cs="Arial" w:eastAsia="Arial" w:hAnsi="Arial"/>
+          <w:b/>
+          <w:bCs/>
+          <w:sz w:val="20"/>
+          <w:szCs w:val="20"/>
+        </w:rPr>
+        <w:t xml:space="preserve">WE 1.06, 1.08, 1.10: </w:t>
+      </w:r>
+      <w:r>
+        <w:rPr>
+          <w:rFonts w:ascii="Arial" w:cs="Arial" w:eastAsia="Arial" w:hAnsi="Arial"/>
+          <w:sz w:val="20"/>
+          <w:szCs w:val="20"/>
+        </w:rPr>
+        <w:t xml:space="preserve">unverändert. Wohn- und Schlafräume, Fenster und Balkonzugänge bleiben in allen Wohnungen gleich.</w:t>
       </w:r>
     </w:p>
     <w:p>
       <w:pPr>
         <w:sectPr>
-          <w:footerReference w:type="default" r:id="rId7"/>
-          <w:pgSz w:w="11906" w:h="16838" w:orient="portrait"/>
-          <w:pgMar w:top="1134" w:right="1440" w:bottom="1134" w:left="1440" w:header="708" w:footer="708" w:gutter="0"/>
+          <w:footerReference w:type="default" r:id="rId10"/>
+          <w:pgSz w:w="16838" w:h="11906" w:orient="landscape"/>
+          <w:pgMar w:top="900" w:right="900" w:bottom="900" w:left="900" w:header="708" w:footer="708" w:gutter="0"/>
           <w:pgNumType/>
           <w:docGrid w:linePitch="360"/>
         </w:sectPr>
@@ -966,7 +1579,7 @@
                     </pic:cNvPicPr>
                   </pic:nvPicPr>
                   <pic:blipFill>
-                    <a:blip r:embed="rId9" cstate="none"/>
+                    <a:blip r:embed="rId16" cstate="none"/>
                     <a:srcRect/>
                     <a:stretch>
                       <a:fillRect/>
@@ -1003,7 +1616,7 @@
       </w:r>
     </w:p>
     <w:sectPr>
-      <w:footerReference w:type="default" r:id="rId8"/>
+      <w:footerReference w:type="default" r:id="rId11"/>
       <w:pgSz w:w="16838" w:h="11906" w:orient="landscape"/>
       <w:pgMar w:top="900" w:right="900" w:bottom="900" w:left="900" w:header="708" w:footer="708" w:gutter="0"/>
       <w:pgNumType/>
@@ -1086,6 +1699,99 @@
 </file>
 
 <file path=word/footer2.xml><?xml version="1.0" encoding="utf-8"?>
+<w:ftr xmlns:wpc="http://schemas.microsoft.com/office/word/2010/wordprocessingCanvas" xmlns:mc="http://schemas.openxmlformats.org/markup-compatibility/2006" xmlns:o="urn:schemas-microsoft-com:office:office" xmlns:r="http://schemas.openxmlformats.org/officeDocument/2006/relationships" xmlns:m="http://schemas.openxmlformats.org/officeDocument/2006/math" xmlns:v="urn:schemas-microsoft-com:vml" xmlns:wp14="http://schemas.microsoft.com/office/word/2010/wordprocessingDrawing" xmlns:wp="http://schemas.openxmlformats.org/drawingml/2006/wordprocessingDrawing" xmlns:w10="urn:schemas-microsoft-com:office:word" xmlns:w="http://schemas.openxmlformats.org/wordprocessingml/2006/main" xmlns:w14="http://schemas.microsoft.com/office/word/2010/wordml" xmlns:w15="http://schemas.microsoft.com/office/word/2012/wordml" xmlns:wpg="http://schemas.microsoft.com/office/word/2010/wordprocessingGroup" xmlns:wpi="http://schemas.microsoft.com/office/word/2010/wordprocessingInk" xmlns:wne="http://schemas.microsoft.com/office/word/2006/wordml" xmlns:wps="http://schemas.microsoft.com/office/word/2010/wordprocessingShape">
+  <w:p>
+    <w:pPr>
+      <w:jc w:val="right"/>
+    </w:pPr>
+    <w:r>
+      <w:rPr>
+        <w:rFonts w:ascii="Arial" w:cs="Arial" w:eastAsia="Arial" w:hAnsi="Arial"/>
+        <w:color w:val="808080"/>
+        <w:sz w:val="16"/>
+        <w:szCs w:val="16"/>
+      </w:rPr>
+      <w:t xml:space="preserve">Schlegelstraße 3 · Installationsknoten · Seite </w:t>
+    </w:r>
+    <w:r>
+      <w:rPr>
+        <w:rFonts w:ascii="Arial" w:cs="Arial" w:eastAsia="Arial" w:hAnsi="Arial"/>
+        <w:color w:val="808080"/>
+        <w:sz w:val="16"/>
+        <w:szCs w:val="16"/>
+      </w:rPr>
+      <w:fldChar w:fldCharType="begin"/>
+      <w:instrText xml:space="preserve">PAGE</w:instrText>
+      <w:fldChar w:fldCharType="separate"/>
+      <w:fldChar w:fldCharType="end"/>
+    </w:r>
+  </w:p>
+</w:ftr>
+</file>
+
+<file path=word/footer3.xml><?xml version="1.0" encoding="utf-8"?>
+<w:ftr xmlns:wpc="http://schemas.microsoft.com/office/word/2010/wordprocessingCanvas" xmlns:mc="http://schemas.openxmlformats.org/markup-compatibility/2006" xmlns:o="urn:schemas-microsoft-com:office:office" xmlns:r="http://schemas.openxmlformats.org/officeDocument/2006/relationships" xmlns:m="http://schemas.openxmlformats.org/officeDocument/2006/math" xmlns:v="urn:schemas-microsoft-com:vml" xmlns:wp14="http://schemas.microsoft.com/office/word/2010/wordprocessingDrawing" xmlns:wp="http://schemas.openxmlformats.org/drawingml/2006/wordprocessingDrawing" xmlns:w10="urn:schemas-microsoft-com:office:word" xmlns:w="http://schemas.openxmlformats.org/wordprocessingml/2006/main" xmlns:w14="http://schemas.microsoft.com/office/word/2010/wordml" xmlns:w15="http://schemas.microsoft.com/office/word/2012/wordml" xmlns:wpg="http://schemas.microsoft.com/office/word/2010/wordprocessingGroup" xmlns:wpi="http://schemas.microsoft.com/office/word/2010/wordprocessingInk" xmlns:wne="http://schemas.microsoft.com/office/word/2006/wordml" xmlns:wps="http://schemas.microsoft.com/office/word/2010/wordprocessingShape">
+  <w:p>
+    <w:pPr>
+      <w:jc w:val="right"/>
+    </w:pPr>
+    <w:r>
+      <w:rPr>
+        <w:rFonts w:ascii="Arial" w:cs="Arial" w:eastAsia="Arial" w:hAnsi="Arial"/>
+        <w:color w:val="808080"/>
+        <w:sz w:val="16"/>
+        <w:szCs w:val="16"/>
+      </w:rPr>
+      <w:t xml:space="preserve">Schlegelstraße 3 · Installationsknoten · Seite </w:t>
+    </w:r>
+    <w:r>
+      <w:rPr>
+        <w:rFonts w:ascii="Arial" w:cs="Arial" w:eastAsia="Arial" w:hAnsi="Arial"/>
+        <w:color w:val="808080"/>
+        <w:sz w:val="16"/>
+        <w:szCs w:val="16"/>
+      </w:rPr>
+      <w:fldChar w:fldCharType="begin"/>
+      <w:instrText xml:space="preserve">PAGE</w:instrText>
+      <w:fldChar w:fldCharType="separate"/>
+      <w:fldChar w:fldCharType="end"/>
+    </w:r>
+  </w:p>
+</w:ftr>
+</file>
+
+<file path=word/footer4.xml><?xml version="1.0" encoding="utf-8"?>
+<w:ftr xmlns:wpc="http://schemas.microsoft.com/office/word/2010/wordprocessingCanvas" xmlns:mc="http://schemas.openxmlformats.org/markup-compatibility/2006" xmlns:o="urn:schemas-microsoft-com:office:office" xmlns:r="http://schemas.openxmlformats.org/officeDocument/2006/relationships" xmlns:m="http://schemas.openxmlformats.org/officeDocument/2006/math" xmlns:v="urn:schemas-microsoft-com:vml" xmlns:wp14="http://schemas.microsoft.com/office/word/2010/wordprocessingDrawing" xmlns:wp="http://schemas.openxmlformats.org/drawingml/2006/wordprocessingDrawing" xmlns:w10="urn:schemas-microsoft-com:office:word" xmlns:w="http://schemas.openxmlformats.org/wordprocessingml/2006/main" xmlns:w14="http://schemas.microsoft.com/office/word/2010/wordml" xmlns:w15="http://schemas.microsoft.com/office/word/2012/wordml" xmlns:wpg="http://schemas.microsoft.com/office/word/2010/wordprocessingGroup" xmlns:wpi="http://schemas.microsoft.com/office/word/2010/wordprocessingInk" xmlns:wne="http://schemas.microsoft.com/office/word/2006/wordml" xmlns:wps="http://schemas.microsoft.com/office/word/2010/wordprocessingShape">
+  <w:p>
+    <w:pPr>
+      <w:jc w:val="right"/>
+    </w:pPr>
+    <w:r>
+      <w:rPr>
+        <w:rFonts w:ascii="Arial" w:cs="Arial" w:eastAsia="Arial" w:hAnsi="Arial"/>
+        <w:color w:val="808080"/>
+        <w:sz w:val="16"/>
+        <w:szCs w:val="16"/>
+      </w:rPr>
+      <w:t xml:space="preserve">Schlegelstraße 3 · Installationsknoten · Seite </w:t>
+    </w:r>
+    <w:r>
+      <w:rPr>
+        <w:rFonts w:ascii="Arial" w:cs="Arial" w:eastAsia="Arial" w:hAnsi="Arial"/>
+        <w:color w:val="808080"/>
+        <w:sz w:val="16"/>
+        <w:szCs w:val="16"/>
+      </w:rPr>
+      <w:fldChar w:fldCharType="begin"/>
+      <w:instrText xml:space="preserve">PAGE</w:instrText>
+      <w:fldChar w:fldCharType="separate"/>
+      <w:fldChar w:fldCharType="end"/>
+    </w:r>
+  </w:p>
+</w:ftr>
+</file>
+
+<file path=word/footer5.xml><?xml version="1.0" encoding="utf-8"?>
 <w:ftr xmlns:wpc="http://schemas.microsoft.com/office/word/2010/wordprocessingCanvas" xmlns:mc="http://schemas.openxmlformats.org/markup-compatibility/2006" xmlns:o="urn:schemas-microsoft-com:office:office" xmlns:r="http://schemas.openxmlformats.org/officeDocument/2006/relationships" xmlns:m="http://schemas.openxmlformats.org/officeDocument/2006/math" xmlns:v="urn:schemas-microsoft-com:vml" xmlns:wp14="http://schemas.microsoft.com/office/word/2010/wordprocessingDrawing" xmlns:wp="http://schemas.openxmlformats.org/drawingml/2006/wordprocessingDrawing" xmlns:w10="urn:schemas-microsoft-com:office:word" xmlns:w="http://schemas.openxmlformats.org/wordprocessingml/2006/main" xmlns:w14="http://schemas.microsoft.com/office/word/2010/wordml" xmlns:w15="http://schemas.microsoft.com/office/word/2012/wordml" xmlns:wpg="http://schemas.microsoft.com/office/word/2010/wordprocessingGroup" xmlns:wpi="http://schemas.microsoft.com/office/word/2010/wordprocessingInk" xmlns:wne="http://schemas.microsoft.com/office/word/2006/wordml" xmlns:wps="http://schemas.microsoft.com/office/word/2010/wordprocessingShape">
   <w:p>
     <w:pPr>

</xml_diff>

<commit_message>
Schlegelstraße 3: Flächen WE 1.05/1.09 korrigiert, Türlagen als Prüfpunkt, Rückfallvariante
Co-Authored-By: Claude Opus 5.5 <noreply@anthropic.com>
Claude-Session: https://claude.ai/code/session_01JR27X7ZZq2WAyXu3NS9X5Z
</commit_message>
<xml_diff>
--- a/schlegelstrasse-3/Kurzerlaeuterung_Installationsknoten.docx
+++ b/schlegelstrasse-3/Kurzerlaeuterung_Installationsknoten.docx
@@ -44,7 +44,7 @@
           <w:sz w:val="18"/>
           <w:szCs w:val="18"/>
         </w:rPr>
-        <w:t xml:space="preserve">Stand 29.10.2026 · Grundlage: Ausführungsplanung Index A (301_A_H5_1051 / 1301)</w:t>
+        <w:t xml:space="preserve">Stand 29.10.2026 (V2) · Grundlage: Ausführungsplanung Index A (301_A_H5_1051 / 1301)</w:t>
       </w:r>
     </w:p>
     <w:p>
@@ -240,7 +240,77 @@
           <w:sz w:val="20"/>
           <w:szCs w:val="20"/>
         </w:rPr>
-        <w:t xml:space="preserve"> statt rund 17 Einzelstandorten. Das sind etwa 60 % weniger Strangpositionen, Deckendurchbrüche und Verkofferungen. Die Wohnungsgrößen bleiben erhalten.</w:t>
+        <w:t xml:space="preserve"> statt rund 17 Einzelstandorten. Das sind etwa 60 % weniger Strangpositionen, Deckendurchbrüche und Verkofferungen. Die Wohnungsgrößen bleiben erhalten; nur in WE 1.05 und 1.09 verschieben sich rund 0,8 m² vom Wohnen zum Schlafen.</w:t>
+      </w:r>
+    </w:p>
+    <w:p>
+      <w:pPr>
+        <w:spacing w:after="80" w:before="200"/>
+      </w:pPr>
+      <w:r>
+        <w:rPr>
+          <w:rFonts w:ascii="Arial" w:cs="Arial" w:eastAsia="Arial" w:hAnsi="Arial"/>
+          <w:b/>
+          <w:bCs/>
+          <w:color w:val="1F4E79"/>
+          <w:sz w:val="23"/>
+          <w:szCs w:val="23"/>
+        </w:rPr>
+        <w:t xml:space="preserve">Kritischer Punkt und Rückfallvariante</w:t>
+      </w:r>
+    </w:p>
+    <w:p>
+      <w:pPr>
+        <w:spacing w:after="80"/>
+      </w:pPr>
+      <w:r>
+        <w:rPr>
+          <w:rFonts w:ascii="Arial" w:cs="Arial" w:eastAsia="Arial" w:hAnsi="Arial"/>
+          <w:sz w:val="20"/>
+          <w:szCs w:val="20"/>
+        </w:rPr>
+        <w:t xml:space="preserve">Durch den Tausch von Bad und Flur wandern die Wohnungstüren von WE 1.05 und 1.09 zur anderen Achse. Die Flurwände sind tragend, die neue Türlage braucht einen statischen Nachweis.</w:t>
+      </w:r>
+    </w:p>
+    <w:p>
+      <w:pPr>
+        <w:spacing w:after="80"/>
+      </w:pPr>
+      <w:r>
+        <w:rPr>
+          <w:rFonts w:ascii="Arial" w:cs="Arial" w:eastAsia="Arial" w:hAnsi="Arial"/>
+          <w:b/>
+          <w:bCs/>
+          <w:sz w:val="20"/>
+          <w:szCs w:val="20"/>
+        </w:rPr>
+        <w:t xml:space="preserve">Rückfallvariante: </w:t>
+      </w:r>
+      <w:r>
+        <w:rPr>
+          <w:rFonts w:ascii="Arial" w:cs="Arial" w:eastAsia="Arial" w:hAnsi="Arial"/>
+          <w:sz w:val="20"/>
+          <w:szCs w:val="20"/>
+        </w:rPr>
+        <w:t xml:space="preserve">Ist das nicht möglich, bleiben WE 1.05 und 1.09 wie geplant mit eigenem Schacht. Ergebnis dann </w:t>
+      </w:r>
+      <w:r>
+        <w:rPr>
+          <w:rFonts w:ascii="Arial" w:cs="Arial" w:eastAsia="Arial" w:hAnsi="Arial"/>
+          <w:b/>
+          <w:bCs/>
+          <w:sz w:val="20"/>
+          <w:szCs w:val="20"/>
+        </w:rPr>
+        <w:t xml:space="preserve">9 Knoten + 1 Kernschacht</w:t>
+      </w:r>
+      <w:r>
+        <w:rPr>
+          <w:rFonts w:ascii="Arial" w:cs="Arial" w:eastAsia="Arial" w:hAnsi="Arial"/>
+          <w:sz w:val="20"/>
+          <w:szCs w:val="20"/>
+        </w:rPr>
+        <w:t xml:space="preserve"> (rund 45 % weniger Standorte). Alle anderen Änderungen bleiben gültig.</w:t>
       </w:r>
     </w:p>
     <w:p>
@@ -303,7 +373,7 @@
           <w:sz w:val="20"/>
           <w:szCs w:val="20"/>
         </w:rPr>
-        <w:t xml:space="preserve">Statik: Kernbohrungen in den Querwänden B, D, F, G und Deckendurchbrüche (Prüfstatik)</w:t>
+        <w:t xml:space="preserve">Statik: neue Türöffnungen WE 1.05/1.09 in der Flurwand (entscheidet über Vorschlag oder Rückfallvariante), Kernbohrungen und Deckendurchbrüche</w:t>
       </w:r>
     </w:p>
     <w:p>
@@ -597,7 +667,7 @@
                 <w:sz w:val="19"/>
                 <w:szCs w:val="19"/>
               </w:rPr>
-              <w:t xml:space="preserve">Bad und Flur getauscht: Bad an Achse G, Rücken an Rücken mit Bad 1.06. Flur und Eingang an Achse F. Küchenzeile an der Bad-Rückwand. Gemeinsamer Schacht IS 6.</w:t>
+              <w:t xml:space="preserve">Bad und Flur getauscht: Bad an Achse G, Rücken an Rücken mit Bad 1.06. Flur und Eingang an Achse F. Küchenzeile an der Bad-Rückwand. Gemeinsamer Schacht IS 6. Wohnen/Kochen ≈ 13,90 m² (−0,77), Schlafen ≈ 9,90 m² (+0,71), WE ≈ 31,71 m².</w:t>
             </w:r>
           </w:p>
         </w:tc>
@@ -686,7 +756,7 @@
                 <w:sz w:val="19"/>
                 <w:szCs w:val="19"/>
               </w:rPr>
-              <w:t xml:space="preserve">Bad und Flur getauscht: Bad an Achse F, Rücken an Rücken mit Bad 1.10. Flur und Eingang an Achse G. Küchenzeile an der Bad-Rückwand. Gemeinsamer Schacht IS 5.</w:t>
+              <w:t xml:space="preserve">Bad und Flur getauscht: Bad an Achse F, Rücken an Rücken mit Bad 1.10. Flur und Eingang an Achse G. Küchenzeile an der Bad-Rückwand. Gemeinsamer Schacht IS 5. Flächen wie WE 1.05.</w:t>
             </w:r>
           </w:p>
         </w:tc>
@@ -970,7 +1040,7 @@
           <w:sz w:val="19"/>
           <w:szCs w:val="19"/>
         </w:rPr>
-        <w:t xml:space="preserve">Raum- und Wohnungsflächen bleiben gemäß AP Index A erhalten. Abweichungen durch die Schachtlage liegen je Wohnung unter 0,5 m².</w:t>
+        <w:t xml:space="preserve">Alle übrigen Raum- und Wohnungsflächen bleiben gemäß AP Index A erhalten. Werte für WE 1.05/1.09 überschlägig, Bilanzierung in der Werkplanung. Rückfallvariante: WE 1.05 und 1.09 bleiben wie AP Index A (Flächen unverändert, je eigener Schacht).</w:t>
       </w:r>
     </w:p>
     <w:p>
@@ -1474,7 +1544,7 @@
           <w:sz w:val="20"/>
           <w:szCs w:val="20"/>
         </w:rPr>
-        <w:t xml:space="preserve">Bad und Flur getauscht. Das Bad liegt jetzt an Achse G neben Bad 1.06, beide an Schacht IS 6.</w:t>
+        <w:t xml:space="preserve">Bad und Flur getauscht. Das Bad liegt jetzt an Achse G neben Bad 1.06, beide an Schacht IS 6. Neue Türlage (!) nur mit statischem Nachweis.</w:t>
       </w:r>
     </w:p>
     <w:p>
@@ -1502,7 +1572,7 @@
           <w:sz w:val="20"/>
           <w:szCs w:val="20"/>
         </w:rPr>
-        <w:t xml:space="preserve">Bad und Flur getauscht. Das Bad liegt jetzt an Achse F neben Bad 1.10, beide an Schacht IS 5.</w:t>
+        <w:t xml:space="preserve">Bad und Flur getauscht. Das Bad liegt jetzt an Achse F neben Bad 1.10, beide an Schacht IS 5. Neue Türlage (!) wie bei WE 1.05.</w:t>
       </w:r>
     </w:p>
     <w:p>

</xml_diff>